<commit_message>
docs: Phase 8.4 presentation and wrap (fleet dispatch capstone)
README: add Phase 8 fleet-dispatch deep-dive (greedy vs CP-SAT global assignment, verdict table, chart); update Project status to Phases 1-8 / 600 tests / tags v0.8.3 + v0.8-complete; add Phase 8 glance row; What-I-learned now eight phases + a coordination-is-a-boundary lesson; Limitations + Next work reframed (fleet is evaluation-only; live fleet dispatch is open).

ARCHITECTURE: eight-phase arc table + Phase 8 row; FleetDispatchPolicy port + CP-SAT fleet-assignment adapter in the layer map; fleet coordination + fleet simulator in the directories note; eight-phase header.

Project Book (.docx): append a 'Where It Landed' Phase 8 section (append-only; original planning text intact).

Docs-only; no code touched; full suite unchanged at 600 passing.

Closes #58

Co-authored-by: Copilot <223556219+Copilot@users.noreply.github.com>
</commit_message>
<xml_diff>
--- a/FreightBid Agent Project Book.docx
+++ b/FreightBid Agent Project Book.docx
@@ -1054,12 +1054,12 @@
         <w:pStyle w:val="Heading1"/>
       </w:pPr>
       <w:r>
-        <w:t>Where It Landed — Delivery Status (Phases 1–7 Complete)</w:t>
+        <w:t>Where It Landed — Delivery Status (Phases 1–8 Complete)</w:t>
       </w:r>
     </w:p>
     <w:p>
       <w:r>
-        <w:t>As of the v0.7-complete capstone, every phase in this plan has been built, tested, and shipped. The project is a finished portfolio build: 556 automated tests pass on main, and each phase carries reproducible benchmarks and committed result artifacts. Everything above is the original forward-looking plan; this addendum records what was actually delivered. Release tags v0.1.0 through v0.7.5 mark the individual milestones, and v0.7-complete marks the full-project capstone.</w:t>
+        <w:t>As of the v0.7-complete capstone, every phase in this plan has been built, tested, and shipped. The project is a finished portfolio build: 556 automated tests pass on main, and each phase carries reproducible benchmarks and committed result artifacts. Everything above is the original forward-looking plan; this addendum records what was actually delivered. Release tags v0.1.0 through v0.7.5 mark the individual milestones, and v0.7-complete marks the full-project capstone. The v0.8-complete tag adds Phase 8, multi-truck fleet dispatch, as an evaluation-only modeling phase.</w:t>
       </w:r>
     </w:p>
     <w:p>
@@ -1190,6 +1190,52 @@
     <w:p>
       <w:r>
         <w:t>The “Phase 4 — Agent layer” section earlier in this book reflects the original numbering. As recorded in the “Updated Phase Sequence” above, Phase 4 was redefined to Broker / Load Quality &amp; Winnability, and the agent / workflow-distillation idea moved to Phase 6 (the Compiled Dispatcher Agent). The earlier heading is preserved for history; the delivered sequence is the one listed in this addendum.</w:t>
+      </w:r>
+    </w:p>
+    <w:p>
+      <w:pPr>
+        <w:pStyle w:val="Heading2"/>
+      </w:pPr>
+      <w:r>
+        <w:t>Phase 8 – Fleet Dispatch &amp; Multi-Truck Assignment (added after the original plan was written)</w:t>
+      </w:r>
+    </w:p>
+    <w:p>
+      <w:pPr/>
+      <w:r>
+        <w:t>Phase 8 extended the single-truck engine to a fleet, as an evaluation-only modeling phase (no API/CLI authority, no auto-bidding, no new models). It asks whether globally coordinated truck-to-load assignment beats uncoordinated single-truck greedy over one shared load board. Shipped as tags v0.8.1, v0.8.2, v0.8.3 and the v0.8-complete capstone.</w:t>
+      </w:r>
+    </w:p>
+    <w:p>
+      <w:pPr>
+        <w:pStyle w:val="ListBullet"/>
+      </w:pPr>
+      <w:r>
+        <w:t>8.1 Fleet Domain + Assignment Policies: an Assignment/Fleet domain model, a FleetDispatchPolicy port, a conflict-free greedy policy, and an OR-Tools CP-SAT max-profit assignment policy. Every truck-load pair is priced through the existing evaluator, so fleet financials reconcile with all prior phases.</w:t>
+      </w:r>
+    </w:p>
+    <w:p>
+      <w:pPr>
+        <w:pStyle w:val="ListBullet"/>
+      </w:pPr>
+      <w:r>
+        <w:t>8.2 Fleet Rolling-Horizon Simulator + Metrics: an event-driven simulator advancing K trucks over one shared, consumable board, with fleet metrics for profit balance (dispersion/Gini), destination concentration (HHI), and contention. A hard K=1 invariant proves fleet-aware reproduces the single-truck greedy trajectory exactly.</w:t>
+      </w:r>
+    </w:p>
+    <w:p>
+      <w:pPr>
+        <w:pStyle w:val="ListBullet"/>
+      </w:pPr>
+      <w:r>
+        <w:t>8.3 Greedy-vs-Fleet-Aware Benchmark (capstone): 50 common-random-number worlds per condition for a 5-truck fleet, greedy vs CP-SAT assignment, with a committed summary plus chart and CI-based verdicts.</w:t>
+      </w:r>
+    </w:p>
+    <w:p>
+      <w:pPr>
+        <w:pStyle w:val="ListBullet"/>
+      </w:pPr>
+      <w:r>
+        <w:t>Result: coordination HOLDS where contention is real - a homogeneous fleet on a thin board gains +20.9 profit [+5.8, +45.4] and -3.9% deadhead, with dense and competition-skimmed boards also HOLDS; 0 of 5 conditions regress. A small, consistent, never-negative edge - a boundary, not a trophy. 44 new tests; full suite 600 passing.</w:t>
       </w:r>
     </w:p>
     <w:sectPr>

</xml_diff>

<commit_message>
docs: Phase 8.4 presentation and wrap (fleet dispatch capstone) (#62)
README: add Phase 8 fleet-dispatch deep-dive (greedy vs CP-SAT global assignment, verdict table, chart); update Project status to Phases 1-8 / 600 tests / tags v0.8.3 + v0.8-complete; add Phase 8 glance row; What-I-learned now eight phases + a coordination-is-a-boundary lesson; Limitations + Next work reframed (fleet is evaluation-only; live fleet dispatch is open).

ARCHITECTURE: eight-phase arc table + Phase 8 row; FleetDispatchPolicy port + CP-SAT fleet-assignment adapter in the layer map; fleet coordination + fleet simulator in the directories note; eight-phase header.

Project Book (.docx): append a 'Where It Landed' Phase 8 section (append-only; original planning text intact).

Docs-only; no code touched; full suite unchanged at 600 passing.

Closes #58

Co-authored-by: Copilot <223556219+Copilot@users.noreply.github.com>
</commit_message>
<xml_diff>
--- a/FreightBid Agent Project Book.docx
+++ b/FreightBid Agent Project Book.docx
@@ -1054,12 +1054,12 @@
         <w:pStyle w:val="Heading1"/>
       </w:pPr>
       <w:r>
-        <w:t>Where It Landed — Delivery Status (Phases 1–7 Complete)</w:t>
+        <w:t>Where It Landed — Delivery Status (Phases 1–8 Complete)</w:t>
       </w:r>
     </w:p>
     <w:p>
       <w:r>
-        <w:t>As of the v0.7-complete capstone, every phase in this plan has been built, tested, and shipped. The project is a finished portfolio build: 556 automated tests pass on main, and each phase carries reproducible benchmarks and committed result artifacts. Everything above is the original forward-looking plan; this addendum records what was actually delivered. Release tags v0.1.0 through v0.7.5 mark the individual milestones, and v0.7-complete marks the full-project capstone.</w:t>
+        <w:t>As of the v0.7-complete capstone, every phase in this plan has been built, tested, and shipped. The project is a finished portfolio build: 556 automated tests pass on main, and each phase carries reproducible benchmarks and committed result artifacts. Everything above is the original forward-looking plan; this addendum records what was actually delivered. Release tags v0.1.0 through v0.7.5 mark the individual milestones, and v0.7-complete marks the full-project capstone. The v0.8-complete tag adds Phase 8, multi-truck fleet dispatch, as an evaluation-only modeling phase.</w:t>
       </w:r>
     </w:p>
     <w:p>
@@ -1190,6 +1190,52 @@
     <w:p>
       <w:r>
         <w:t>The “Phase 4 — Agent layer” section earlier in this book reflects the original numbering. As recorded in the “Updated Phase Sequence” above, Phase 4 was redefined to Broker / Load Quality &amp; Winnability, and the agent / workflow-distillation idea moved to Phase 6 (the Compiled Dispatcher Agent). The earlier heading is preserved for history; the delivered sequence is the one listed in this addendum.</w:t>
+      </w:r>
+    </w:p>
+    <w:p>
+      <w:pPr>
+        <w:pStyle w:val="Heading2"/>
+      </w:pPr>
+      <w:r>
+        <w:t>Phase 8 – Fleet Dispatch &amp; Multi-Truck Assignment (added after the original plan was written)</w:t>
+      </w:r>
+    </w:p>
+    <w:p>
+      <w:pPr/>
+      <w:r>
+        <w:t>Phase 8 extended the single-truck engine to a fleet, as an evaluation-only modeling phase (no API/CLI authority, no auto-bidding, no new models). It asks whether globally coordinated truck-to-load assignment beats uncoordinated single-truck greedy over one shared load board. Shipped as tags v0.8.1, v0.8.2, v0.8.3 and the v0.8-complete capstone.</w:t>
+      </w:r>
+    </w:p>
+    <w:p>
+      <w:pPr>
+        <w:pStyle w:val="ListBullet"/>
+      </w:pPr>
+      <w:r>
+        <w:t>8.1 Fleet Domain + Assignment Policies: an Assignment/Fleet domain model, a FleetDispatchPolicy port, a conflict-free greedy policy, and an OR-Tools CP-SAT max-profit assignment policy. Every truck-load pair is priced through the existing evaluator, so fleet financials reconcile with all prior phases.</w:t>
+      </w:r>
+    </w:p>
+    <w:p>
+      <w:pPr>
+        <w:pStyle w:val="ListBullet"/>
+      </w:pPr>
+      <w:r>
+        <w:t>8.2 Fleet Rolling-Horizon Simulator + Metrics: an event-driven simulator advancing K trucks over one shared, consumable board, with fleet metrics for profit balance (dispersion/Gini), destination concentration (HHI), and contention. A hard K=1 invariant proves fleet-aware reproduces the single-truck greedy trajectory exactly.</w:t>
+      </w:r>
+    </w:p>
+    <w:p>
+      <w:pPr>
+        <w:pStyle w:val="ListBullet"/>
+      </w:pPr>
+      <w:r>
+        <w:t>8.3 Greedy-vs-Fleet-Aware Benchmark (capstone): 50 common-random-number worlds per condition for a 5-truck fleet, greedy vs CP-SAT assignment, with a committed summary plus chart and CI-based verdicts.</w:t>
+      </w:r>
+    </w:p>
+    <w:p>
+      <w:pPr>
+        <w:pStyle w:val="ListBullet"/>
+      </w:pPr>
+      <w:r>
+        <w:t>Result: coordination HOLDS where contention is real - a homogeneous fleet on a thin board gains +20.9 profit [+5.8, +45.4] and -3.9% deadhead, with dense and competition-skimmed boards also HOLDS; 0 of 5 conditions regress. A small, consistent, never-negative edge - a boundary, not a trophy. 44 new tests; full suite 600 passing.</w:t>
       </w:r>
     </w:p>
     <w:sectPr>

</xml_diff>